<commit_message>
updated doc model definitions
</commit_message>
<xml_diff>
--- a/docs/definitions.docx
+++ b/docs/definitions.docx
@@ -24,12 +24,12 @@
       <w:tblGrid>
         <w:gridCol w:w="1010"/>
         <w:gridCol w:w="826"/>
-        <w:gridCol w:w="2416"/>
+        <w:gridCol w:w="2577"/>
         <w:gridCol w:w="680"/>
         <w:gridCol w:w="1281"/>
         <w:gridCol w:w="2427"/>
-        <w:gridCol w:w="1126"/>
-        <w:gridCol w:w="4511"/>
+        <w:gridCol w:w="1109"/>
+        <w:gridCol w:w="4367"/>
       </w:tblGrid>
       <w:tr>
         <w:trPr>
@@ -175,7 +175,7 @@
         </w:tc>
         <w:tc>
           <w:tcPr>
-            <w:tcW w:w="2364" w:type="dxa"/>
+            <w:tcW w:w="2427" w:type="dxa"/>
           </w:tcPr>
           <w:p>
             <w:pPr>
@@ -360,7 +360,7 @@
         </w:tc>
         <w:tc>
           <w:tcPr>
-            <w:tcW w:w="2364" w:type="dxa"/>
+            <w:tcW w:w="2427" w:type="dxa"/>
           </w:tcPr>
           <w:p>
             <w:pPr>
@@ -533,7 +533,7 @@
         </w:tc>
         <w:tc>
           <w:tcPr>
-            <w:tcW w:w="2364" w:type="dxa"/>
+            <w:tcW w:w="2427" w:type="dxa"/>
           </w:tcPr>
           <w:p>
             <w:pPr>
@@ -706,7 +706,7 @@
         </w:tc>
         <w:tc>
           <w:tcPr>
-            <w:tcW w:w="2364" w:type="dxa"/>
+            <w:tcW w:w="2427" w:type="dxa"/>
           </w:tcPr>
           <w:p>
             <w:pPr>
@@ -879,7 +879,7 @@
         </w:tc>
         <w:tc>
           <w:tcPr>
-            <w:tcW w:w="2364" w:type="dxa"/>
+            <w:tcW w:w="2427" w:type="dxa"/>
           </w:tcPr>
           <w:p>
             <w:pPr>
@@ -1052,7 +1052,7 @@
         </w:tc>
         <w:tc>
           <w:tcPr>
-            <w:tcW w:w="2364" w:type="dxa"/>
+            <w:tcW w:w="2427" w:type="dxa"/>
           </w:tcPr>
           <w:p>
             <w:pPr>
@@ -1139,7 +1139,6 @@
                 <w:szCs w:val="20"/>
               </w:rPr>
             </w:pPr>
-            <w:proofErr w:type="spellStart"/>
             <w:r>
               <w:rPr>
                 <w:rFonts w:ascii="Cambria Math" w:hAnsi="Cambria Math"/>
@@ -1156,7 +1155,6 @@
               </w:rPr>
               <w:t>arameter</w:t>
             </w:r>
-            <w:proofErr w:type="spellEnd"/>
           </w:p>
         </w:tc>
         <w:tc>
@@ -1172,7 +1170,6 @@
                 <w:szCs w:val="20"/>
               </w:rPr>
             </w:pPr>
-            <w:proofErr w:type="spellStart"/>
             <w:r>
               <w:rPr>
                 <w:rFonts w:ascii="Cambria Math" w:hAnsi="Cambria Math"/>
@@ -1181,7 +1178,6 @@
               </w:rPr>
               <w:t>input</w:t>
             </w:r>
-            <w:proofErr w:type="spellEnd"/>
           </w:p>
         </w:tc>
         <w:tc>
@@ -1197,23 +1193,13 @@
                 <w:lang w:val="en-GB"/>
               </w:rPr>
             </w:pPr>
-            <w:proofErr w:type="spellStart"/>
-            <w:r>
-              <w:rPr>
-                <w:rFonts w:ascii="Cambria Math" w:hAnsi="Cambria Math"/>
-                <w:sz w:val="20"/>
-                <w:szCs w:val="20"/>
-              </w:rPr>
-              <w:t>Weekdays</w:t>
-            </w:r>
-            <w:proofErr w:type="spellEnd"/>
-            <w:r>
-              <w:rPr>
-                <w:rFonts w:ascii="Cambria Math" w:hAnsi="Cambria Math"/>
-                <w:sz w:val="20"/>
-                <w:szCs w:val="20"/>
-              </w:rPr>
-              <w:t xml:space="preserve"> </w:t>
+            <w:r>
+              <w:rPr>
+                <w:rFonts w:ascii="Cambria Math" w:hAnsi="Cambria Math"/>
+                <w:sz w:val="20"/>
+                <w:szCs w:val="20"/>
+              </w:rPr>
+              <w:t xml:space="preserve">Weekdays </w:t>
             </w:r>
           </w:p>
         </w:tc>
@@ -1280,7 +1266,7 @@
         </w:tc>
         <w:tc>
           <w:tcPr>
-            <w:tcW w:w="2364" w:type="dxa"/>
+            <w:tcW w:w="2427" w:type="dxa"/>
           </w:tcPr>
           <w:p>
             <w:pPr>
@@ -1442,7 +1428,7 @@
         </w:tc>
         <w:tc>
           <w:tcPr>
-            <w:tcW w:w="2364" w:type="dxa"/>
+            <w:tcW w:w="2427" w:type="dxa"/>
           </w:tcPr>
           <w:p>
             <w:pPr>
@@ -1477,25 +1463,14 @@
                 <w:lang w:val="en-GB"/>
               </w:rPr>
             </w:pPr>
-            <w:proofErr w:type="spellStart"/>
-            <w:r>
-              <w:rPr>
-                <w:rFonts w:ascii="Cambria Math" w:hAnsi="Cambria Math"/>
-                <w:sz w:val="20"/>
-                <w:szCs w:val="20"/>
-                <w:lang w:val="en-GB"/>
-              </w:rPr>
-              <w:t>dict</w:t>
-            </w:r>
-            <w:proofErr w:type="spellEnd"/>
-            <w:r>
-              <w:rPr>
-                <w:rFonts w:ascii="Cambria Math" w:hAnsi="Cambria Math"/>
-                <w:sz w:val="20"/>
-                <w:szCs w:val="20"/>
-                <w:lang w:val="en-GB"/>
-              </w:rPr>
-              <w:t>[str, int]</w:t>
+            <w:r>
+              <w:rPr>
+                <w:rFonts w:ascii="Cambria Math" w:hAnsi="Cambria Math"/>
+                <w:sz w:val="20"/>
+                <w:szCs w:val="20"/>
+                <w:lang w:val="en-GB"/>
+              </w:rPr>
+              <w:t>dict[str, int]</w:t>
             </w:r>
           </w:p>
         </w:tc>
@@ -1529,27 +1504,7 @@
                 <w:lang w:val="en-GB"/>
               </w:rPr>
               <w:br/>
-              <w:t>(</w:t>
-            </w:r>
-            <w:proofErr w:type="spellStart"/>
-            <w:r>
-              <w:rPr>
-                <w:rFonts w:ascii="Cambria Math" w:hAnsi="Cambria Math"/>
-                <w:sz w:val="20"/>
-                <w:szCs w:val="20"/>
-                <w:lang w:val="en-GB"/>
-              </w:rPr>
-              <w:t>eg</w:t>
-            </w:r>
-            <w:proofErr w:type="spellEnd"/>
-            <w:r>
-              <w:rPr>
-                <w:rFonts w:ascii="Cambria Math" w:hAnsi="Cambria Math"/>
-                <w:sz w:val="20"/>
-                <w:szCs w:val="20"/>
-                <w:lang w:val="en-GB"/>
-              </w:rPr>
-              <w:t xml:space="preserve"> ‘Mon’ </w:t>
+              <w:t xml:space="preserve">(eg ‘Mon’ </w:t>
             </w:r>
             <w:r>
               <w:rPr>
@@ -1665,7 +1620,7 @@
         </w:tc>
         <w:tc>
           <w:tcPr>
-            <w:tcW w:w="2364" w:type="dxa"/>
+            <w:tcW w:w="2427" w:type="dxa"/>
           </w:tcPr>
           <w:p>
             <w:pPr>
@@ -1699,25 +1654,14 @@
                 <w:lang w:val="en-GB"/>
               </w:rPr>
             </w:pPr>
-            <w:proofErr w:type="spellStart"/>
-            <w:r>
-              <w:rPr>
-                <w:rFonts w:ascii="Cambria Math" w:hAnsi="Cambria Math"/>
-                <w:sz w:val="20"/>
-                <w:szCs w:val="20"/>
-                <w:lang w:val="en-GB"/>
-              </w:rPr>
-              <w:t>dict</w:t>
-            </w:r>
-            <w:proofErr w:type="spellEnd"/>
-            <w:r>
-              <w:rPr>
-                <w:rFonts w:ascii="Cambria Math" w:hAnsi="Cambria Math"/>
-                <w:sz w:val="20"/>
-                <w:szCs w:val="20"/>
-                <w:lang w:val="en-GB"/>
-              </w:rPr>
-              <w:t>[int, str]</w:t>
+            <w:r>
+              <w:rPr>
+                <w:rFonts w:ascii="Cambria Math" w:hAnsi="Cambria Math"/>
+                <w:sz w:val="20"/>
+                <w:szCs w:val="20"/>
+                <w:lang w:val="en-GB"/>
+              </w:rPr>
+              <w:t>dict[int, str]</w:t>
             </w:r>
           </w:p>
         </w:tc>
@@ -1751,27 +1695,7 @@
                 <w:lang w:val="en-GB"/>
               </w:rPr>
               <w:br/>
-              <w:t>(</w:t>
-            </w:r>
-            <w:proofErr w:type="spellStart"/>
-            <w:r>
-              <w:rPr>
-                <w:rFonts w:ascii="Cambria Math" w:hAnsi="Cambria Math"/>
-                <w:sz w:val="20"/>
-                <w:szCs w:val="20"/>
-                <w:lang w:val="en-GB"/>
-              </w:rPr>
-              <w:t>eg</w:t>
-            </w:r>
-            <w:proofErr w:type="spellEnd"/>
-            <w:r>
-              <w:rPr>
-                <w:rFonts w:ascii="Cambria Math" w:hAnsi="Cambria Math"/>
-                <w:sz w:val="20"/>
-                <w:szCs w:val="20"/>
-                <w:lang w:val="en-GB"/>
-              </w:rPr>
-              <w:t xml:space="preserve"> 2 </w:t>
+              <w:t xml:space="preserve">(eg 2 </w:t>
             </w:r>
             <w:r>
               <w:rPr>
@@ -1810,7 +1734,6 @@
                 <w:szCs w:val="20"/>
               </w:rPr>
             </w:pPr>
-            <w:proofErr w:type="spellStart"/>
             <w:r>
               <w:rPr>
                 <w:rFonts w:ascii="Cambria Math" w:hAnsi="Cambria Math"/>
@@ -1827,7 +1750,6 @@
               </w:rPr>
               <w:t>arameter</w:t>
             </w:r>
-            <w:proofErr w:type="spellEnd"/>
           </w:p>
         </w:tc>
         <w:tc>
@@ -1844,7 +1766,6 @@
                 <w:lang w:val="en-GB"/>
               </w:rPr>
             </w:pPr>
-            <w:proofErr w:type="spellStart"/>
             <w:r>
               <w:rPr>
                 <w:rFonts w:ascii="Cambria Math" w:hAnsi="Cambria Math"/>
@@ -1853,7 +1774,6 @@
               </w:rPr>
               <w:t>input</w:t>
             </w:r>
-            <w:proofErr w:type="spellEnd"/>
           </w:p>
         </w:tc>
         <w:tc>
@@ -1869,7 +1789,6 @@
                 <w:lang w:val="en-GB"/>
               </w:rPr>
             </w:pPr>
-            <w:proofErr w:type="spellStart"/>
             <w:r>
               <w:rPr>
                 <w:rFonts w:ascii="Cambria Math" w:hAnsi="Cambria Math"/>
@@ -1879,7 +1798,6 @@
               </w:rPr>
               <w:t>WorkShifts</w:t>
             </w:r>
-            <w:proofErr w:type="spellEnd"/>
           </w:p>
         </w:tc>
         <w:tc>
@@ -1941,18 +1859,17 @@
         </w:tc>
         <w:tc>
           <w:tcPr>
-            <w:tcW w:w="2364" w:type="dxa"/>
-          </w:tcPr>
-          <w:p>
-            <w:pPr>
-              <w:rPr>
-                <w:rFonts w:ascii="Cambria Math" w:hAnsi="Cambria Math"/>
-                <w:sz w:val="20"/>
-                <w:szCs w:val="20"/>
-                <w:lang w:val="en-GB"/>
-              </w:rPr>
-            </w:pPr>
-            <w:proofErr w:type="spellStart"/>
+            <w:tcW w:w="2427" w:type="dxa"/>
+          </w:tcPr>
+          <w:p>
+            <w:pPr>
+              <w:rPr>
+                <w:rFonts w:ascii="Cambria Math" w:hAnsi="Cambria Math"/>
+                <w:sz w:val="20"/>
+                <w:szCs w:val="20"/>
+                <w:lang w:val="en-GB"/>
+              </w:rPr>
+            </w:pPr>
             <w:r>
               <w:rPr>
                 <w:rFonts w:ascii="Cambria Math" w:eastAsia="Aptos" w:hAnsi="Cambria Math" w:cs="Times New Roman"/>
@@ -1962,7 +1879,6 @@
               </w:rPr>
               <w:t>WorkShifts</w:t>
             </w:r>
-            <w:proofErr w:type="spellEnd"/>
           </w:p>
         </w:tc>
         <w:tc>
@@ -2027,27 +1943,7 @@
                 <w:szCs w:val="20"/>
                 <w:lang w:val="en-GB"/>
               </w:rPr>
-              <w:t xml:space="preserve">set of working shifts, excluding </w:t>
-            </w:r>
-            <w:proofErr w:type="spellStart"/>
-            <w:r>
-              <w:rPr>
-                <w:rFonts w:ascii="Cambria Math" w:hAnsi="Cambria Math"/>
-                <w:sz w:val="20"/>
-                <w:szCs w:val="20"/>
-                <w:lang w:val="en-GB"/>
-              </w:rPr>
-              <w:t>ie</w:t>
-            </w:r>
-            <w:proofErr w:type="spellEnd"/>
-            <w:r>
-              <w:rPr>
-                <w:rFonts w:ascii="Cambria Math" w:hAnsi="Cambria Math"/>
-                <w:sz w:val="20"/>
-                <w:szCs w:val="20"/>
-                <w:lang w:val="en-GB"/>
-              </w:rPr>
-              <w:t xml:space="preserve"> free days</w:t>
+              <w:t>set of working shifts, excluding ie free days</w:t>
             </w:r>
           </w:p>
         </w:tc>
@@ -2068,7 +1964,6 @@
                 <w:szCs w:val="20"/>
               </w:rPr>
             </w:pPr>
-            <w:proofErr w:type="spellStart"/>
             <w:r>
               <w:rPr>
                 <w:rFonts w:ascii="Cambria Math" w:hAnsi="Cambria Math"/>
@@ -2085,7 +1980,6 @@
               </w:rPr>
               <w:t>arameter</w:t>
             </w:r>
-            <w:proofErr w:type="spellEnd"/>
           </w:p>
         </w:tc>
         <w:tc>
@@ -2101,7 +1995,6 @@
                 <w:szCs w:val="20"/>
               </w:rPr>
             </w:pPr>
-            <w:proofErr w:type="spellStart"/>
             <w:r>
               <w:rPr>
                 <w:rFonts w:ascii="Cambria Math" w:hAnsi="Cambria Math"/>
@@ -2110,7 +2003,6 @@
               </w:rPr>
               <w:t>input</w:t>
             </w:r>
-            <w:proofErr w:type="spellEnd"/>
           </w:p>
         </w:tc>
         <w:tc>
@@ -2126,7 +2018,6 @@
                 <w:lang w:val="en-GB"/>
               </w:rPr>
             </w:pPr>
-            <w:proofErr w:type="spellStart"/>
             <w:r>
               <w:rPr>
                 <w:rFonts w:ascii="Cambria Math" w:hAnsi="Cambria Math"/>
@@ -2135,7 +2026,6 @@
               </w:rPr>
               <w:t>Shifts</w:t>
             </w:r>
-            <w:proofErr w:type="spellEnd"/>
           </w:p>
         </w:tc>
         <w:tc>
@@ -2204,9 +2094,8 @@
                 <w:lang w:val="en-GB"/>
               </w:rPr>
               <w:br/>
-              <w:t>+</w:t>
-            </w:r>
-            <w:proofErr w:type="spellStart"/>
+              <w:t>+freeDay</w:t>
+            </w:r>
             <w:r>
               <w:rPr>
                 <w:rFonts w:ascii="Cambria Math" w:eastAsia="Aptos" w:hAnsi="Cambria Math" w:cs="Times New Roman"/>
@@ -2216,59 +2105,32 @@
                 <w:szCs w:val="20"/>
                 <w:lang w:val="en-GB"/>
               </w:rPr>
-              <w:t>freeDay</w:t>
-            </w:r>
-            <w:proofErr w:type="spellEnd"/>
+              <w:br/>
+              <w:t>+spareShift</w:t>
+            </w:r>
+          </w:p>
+        </w:tc>
+        <w:tc>
+          <w:tcPr>
+            <w:tcW w:w="2427" w:type="dxa"/>
+          </w:tcPr>
+          <w:p>
+            <w:pPr>
+              <w:rPr>
+                <w:rFonts w:ascii="Cambria Math" w:hAnsi="Cambria Math"/>
+                <w:sz w:val="20"/>
+                <w:szCs w:val="20"/>
+              </w:rPr>
+            </w:pPr>
             <w:r>
               <w:rPr>
                 <w:rFonts w:ascii="Cambria Math" w:eastAsia="Aptos" w:hAnsi="Cambria Math" w:cs="Times New Roman"/>
-                <w:i/>
-                <w:iCs/>
-                <w:sz w:val="20"/>
-                <w:szCs w:val="20"/>
-                <w:lang w:val="en-GB"/>
-              </w:rPr>
-              <w:br/>
-              <w:t>+</w:t>
-            </w:r>
-            <w:proofErr w:type="spellStart"/>
-            <w:r>
-              <w:rPr>
-                <w:rFonts w:ascii="Cambria Math" w:eastAsia="Aptos" w:hAnsi="Cambria Math" w:cs="Times New Roman"/>
-                <w:i/>
-                <w:iCs/>
-                <w:sz w:val="20"/>
-                <w:szCs w:val="20"/>
-                <w:lang w:val="en-GB"/>
-              </w:rPr>
-              <w:t>spareShift</w:t>
-            </w:r>
-            <w:proofErr w:type="spellEnd"/>
-          </w:p>
-        </w:tc>
-        <w:tc>
-          <w:tcPr>
-            <w:tcW w:w="2364" w:type="dxa"/>
-          </w:tcPr>
-          <w:p>
-            <w:pPr>
-              <w:rPr>
-                <w:rFonts w:ascii="Cambria Math" w:hAnsi="Cambria Math"/>
-                <w:sz w:val="20"/>
-                <w:szCs w:val="20"/>
-              </w:rPr>
-            </w:pPr>
-            <w:proofErr w:type="spellStart"/>
-            <w:r>
-              <w:rPr>
-                <w:rFonts w:ascii="Cambria Math" w:eastAsia="Aptos" w:hAnsi="Cambria Math" w:cs="Times New Roman"/>
                 <w:sz w:val="20"/>
                 <w:szCs w:val="20"/>
                 <w:lang w:val="en-GB"/>
               </w:rPr>
               <w:t>shift_objects</w:t>
             </w:r>
-            <w:proofErr w:type="spellEnd"/>
           </w:p>
         </w:tc>
         <w:tc>
@@ -2356,7 +2218,6 @@
                 <w:szCs w:val="20"/>
               </w:rPr>
             </w:pPr>
-            <w:proofErr w:type="spellStart"/>
             <w:r>
               <w:rPr>
                 <w:rFonts w:ascii="Cambria Math" w:hAnsi="Cambria Math"/>
@@ -2373,7 +2234,6 @@
               </w:rPr>
               <w:t>arameter</w:t>
             </w:r>
-            <w:proofErr w:type="spellEnd"/>
           </w:p>
         </w:tc>
         <w:tc>
@@ -2390,7 +2250,6 @@
                 <w:lang w:val="en-GB"/>
               </w:rPr>
             </w:pPr>
-            <w:proofErr w:type="spellStart"/>
             <w:r>
               <w:rPr>
                 <w:rFonts w:ascii="Cambria Math" w:hAnsi="Cambria Math"/>
@@ -2399,7 +2258,6 @@
               </w:rPr>
               <w:t>input</w:t>
             </w:r>
-            <w:proofErr w:type="spellEnd"/>
           </w:p>
         </w:tc>
         <w:tc>
@@ -2508,7 +2366,7 @@
         </w:tc>
         <w:tc>
           <w:tcPr>
-            <w:tcW w:w="2364" w:type="dxa"/>
+            <w:tcW w:w="2427" w:type="dxa"/>
           </w:tcPr>
           <w:p>
             <w:pPr>
@@ -2603,7 +2461,6 @@
                 <w:szCs w:val="20"/>
               </w:rPr>
             </w:pPr>
-            <w:proofErr w:type="spellStart"/>
             <w:r>
               <w:rPr>
                 <w:rFonts w:ascii="Cambria Math" w:hAnsi="Cambria Math"/>
@@ -2620,7 +2477,6 @@
               </w:rPr>
               <w:t>arameter</w:t>
             </w:r>
-            <w:proofErr w:type="spellEnd"/>
           </w:p>
         </w:tc>
         <w:tc>
@@ -2637,7 +2493,6 @@
                 <w:lang w:val="en-GB"/>
               </w:rPr>
             </w:pPr>
-            <w:proofErr w:type="spellStart"/>
             <w:r>
               <w:rPr>
                 <w:rFonts w:ascii="Cambria Math" w:hAnsi="Cambria Math"/>
@@ -2646,7 +2501,6 @@
               </w:rPr>
               <w:t>input</w:t>
             </w:r>
-            <w:proofErr w:type="spellEnd"/>
           </w:p>
         </w:tc>
         <w:tc>
@@ -2756,7 +2610,7 @@
         </w:tc>
         <w:tc>
           <w:tcPr>
-            <w:tcW w:w="2364" w:type="dxa"/>
+            <w:tcW w:w="2427" w:type="dxa"/>
           </w:tcPr>
           <w:p>
             <w:pPr>
@@ -2833,6 +2687,166 @@
               </w:rPr>
               <w:t>range 1 to MAX_CYCLE_WEEKS</w:t>
             </w:r>
+          </w:p>
+        </w:tc>
+      </w:tr>
+      <w:tr>
+        <w:trPr>
+          <w:trHeight w:val="340"/>
+        </w:trPr>
+        <w:tc>
+          <w:tcPr>
+            <w:tcW w:w="0" w:type="auto"/>
+          </w:tcPr>
+          <w:p>
+            <w:pPr>
+              <w:rPr>
+                <w:rFonts w:ascii="Cambria Math" w:hAnsi="Cambria Math"/>
+                <w:sz w:val="20"/>
+                <w:szCs w:val="20"/>
+                <w:lang w:val="en-GB"/>
+              </w:rPr>
+            </w:pPr>
+            <w:r>
+              <w:rPr>
+                <w:rFonts w:ascii="Cambria Math" w:hAnsi="Cambria Math"/>
+                <w:sz w:val="20"/>
+                <w:szCs w:val="20"/>
+                <w:lang w:val="en-GB"/>
+              </w:rPr>
+              <w:t>parameter</w:t>
+            </w:r>
+          </w:p>
+        </w:tc>
+        <w:tc>
+          <w:tcPr>
+            <w:tcW w:w="0" w:type="auto"/>
+            <w:shd w:val="clear" w:color="auto" w:fill="FFFFFF" w:themeFill="background1"/>
+          </w:tcPr>
+          <w:p>
+            <w:pPr>
+              <w:rPr>
+                <w:rFonts w:ascii="Cambria Math" w:hAnsi="Cambria Math"/>
+                <w:sz w:val="20"/>
+                <w:szCs w:val="20"/>
+                <w:lang w:val="en-GB"/>
+              </w:rPr>
+            </w:pPr>
+            <w:r>
+              <w:rPr>
+                <w:rFonts w:ascii="Cambria Math" w:hAnsi="Cambria Math"/>
+                <w:sz w:val="20"/>
+                <w:szCs w:val="20"/>
+                <w:lang w:val="en-GB"/>
+              </w:rPr>
+              <w:t>input</w:t>
+            </w:r>
+          </w:p>
+        </w:tc>
+        <w:tc>
+          <w:tcPr>
+            <w:tcW w:w="0" w:type="auto"/>
+          </w:tcPr>
+          <w:p>
+            <w:pPr>
+              <w:rPr>
+                <w:rFonts w:ascii="Cambria Math" w:eastAsia="Aptos" w:hAnsi="Cambria Math" w:cs="Times New Roman"/>
+                <w:sz w:val="20"/>
+                <w:szCs w:val="20"/>
+                <w:lang w:val="en-GB"/>
+              </w:rPr>
+            </w:pPr>
+            <w:r>
+              <w:rPr>
+                <w:rFonts w:ascii="Cambria Math" w:eastAsia="Aptos" w:hAnsi="Cambria Math" w:cs="Times New Roman"/>
+                <w:sz w:val="20"/>
+                <w:szCs w:val="20"/>
+                <w:lang w:val="en-GB"/>
+              </w:rPr>
+              <w:t>max consecutive working days</w:t>
+            </w:r>
+          </w:p>
+        </w:tc>
+        <w:tc>
+          <w:tcPr>
+            <w:tcW w:w="0" w:type="auto"/>
+          </w:tcPr>
+          <w:p>
+            <w:pPr>
+              <w:rPr>
+                <w:rFonts w:ascii="Cambria Math" w:eastAsia="Aptos" w:hAnsi="Cambria Math" w:cs="Times New Roman"/>
+                <w:sz w:val="20"/>
+                <w:szCs w:val="20"/>
+                <w:lang w:val="en-GB"/>
+              </w:rPr>
+            </w:pPr>
+          </w:p>
+        </w:tc>
+        <w:tc>
+          <w:tcPr>
+            <w:tcW w:w="1281" w:type="dxa"/>
+          </w:tcPr>
+          <w:p>
+            <w:pPr>
+              <w:rPr>
+                <w:rFonts w:ascii="Cambria Math" w:eastAsia="Aptos" w:hAnsi="Cambria Math" w:cs="Times New Roman"/>
+                <w:sz w:val="20"/>
+                <w:szCs w:val="20"/>
+                <w:lang w:val="en-GB"/>
+              </w:rPr>
+            </w:pPr>
+          </w:p>
+        </w:tc>
+        <w:tc>
+          <w:tcPr>
+            <w:tcW w:w="2427" w:type="dxa"/>
+          </w:tcPr>
+          <w:p>
+            <w:pPr>
+              <w:rPr>
+                <w:rFonts w:ascii="Cambria Math" w:hAnsi="Cambria Math"/>
+                <w:sz w:val="20"/>
+                <w:szCs w:val="20"/>
+              </w:rPr>
+            </w:pPr>
+            <w:r>
+              <w:rPr>
+                <w:rFonts w:ascii="Cambria Math" w:hAnsi="Cambria Math"/>
+                <w:sz w:val="20"/>
+                <w:szCs w:val="20"/>
+              </w:rPr>
+              <w:t>MAX_CONSEC_DAYS</w:t>
+            </w:r>
+          </w:p>
+        </w:tc>
+        <w:tc>
+          <w:tcPr>
+            <w:tcW w:w="0" w:type="auto"/>
+          </w:tcPr>
+          <w:p>
+            <w:pPr>
+              <w:rPr>
+                <w:rFonts w:ascii="Cambria Math" w:hAnsi="Cambria Math"/>
+                <w:sz w:val="20"/>
+                <w:szCs w:val="20"/>
+                <w:lang w:val="en-GB"/>
+              </w:rPr>
+            </w:pPr>
+          </w:p>
+        </w:tc>
+        <w:tc>
+          <w:tcPr>
+            <w:tcW w:w="0" w:type="auto"/>
+          </w:tcPr>
+          <w:p>
+            <w:pPr>
+              <w:rPr>
+                <w:rFonts w:ascii="Cambria Math" w:hAnsi="Cambria Math"/>
+                <w:sz w:val="20"/>
+                <w:szCs w:val="20"/>
+                <w:lang w:val="en-GB"/>
+              </w:rPr>
+            </w:pPr>
           </w:p>
         </w:tc>
       </w:tr>
@@ -3093,7 +3107,7 @@
         </w:tc>
         <w:tc>
           <w:tcPr>
-            <w:tcW w:w="2364" w:type="dxa"/>
+            <w:tcW w:w="2427" w:type="dxa"/>
           </w:tcPr>
           <w:p>
             <w:pPr>
@@ -3221,7 +3235,6 @@
               </w:rPr>
               <w:t xml:space="preserve"> works in shift </w:t>
             </w:r>
-            <w:proofErr w:type="spellStart"/>
             <w:r>
               <w:rPr>
                 <w:rFonts w:ascii="Cambria Math" w:hAnsi="Cambria Math"/>
@@ -3240,17 +3253,7 @@
                 <w:szCs w:val="20"/>
                 <w:lang w:val="en-GB"/>
               </w:rPr>
-              <w:t xml:space="preserve"> on</w:t>
-            </w:r>
-            <w:proofErr w:type="spellEnd"/>
-            <w:r>
-              <w:rPr>
-                <w:rFonts w:ascii="Cambria Math" w:hAnsi="Cambria Math"/>
-                <w:sz w:val="20"/>
-                <w:szCs w:val="20"/>
-                <w:lang w:val="en-GB"/>
-              </w:rPr>
-              <w:t xml:space="preserve"> day </w:t>
+              <w:t xml:space="preserve"> on day </w:t>
             </w:r>
             <w:r>
               <w:rPr>
@@ -3484,7 +3487,7 @@
         </w:tc>
         <w:tc>
           <w:tcPr>
-            <w:tcW w:w="2364" w:type="dxa"/>
+            <w:tcW w:w="2427" w:type="dxa"/>
           </w:tcPr>
           <w:p>
             <w:pPr>
@@ -3494,7 +3497,6 @@
                 <w:szCs w:val="20"/>
               </w:rPr>
             </w:pPr>
-            <w:proofErr w:type="spellStart"/>
             <w:r>
               <w:rPr>
                 <w:rFonts w:ascii="Cambria Math" w:eastAsia="Aptos" w:hAnsi="Cambria Math" w:cs="Times New Roman"/>
@@ -3503,7 +3505,6 @@
               </w:rPr>
               <w:t>active_week</w:t>
             </w:r>
-            <w:proofErr w:type="spellEnd"/>
           </w:p>
           <w:p>
             <w:pPr>
@@ -3802,7 +3803,7 @@
         </w:tc>
         <w:tc>
           <w:tcPr>
-            <w:tcW w:w="2364" w:type="dxa"/>
+            <w:tcW w:w="2427" w:type="dxa"/>
           </w:tcPr>
           <w:p>
             <w:pPr>
@@ -3812,7 +3813,6 @@
                 <w:szCs w:val="20"/>
               </w:rPr>
             </w:pPr>
-            <w:proofErr w:type="spellStart"/>
             <w:r>
               <w:rPr>
                 <w:rFonts w:ascii="Cambria Math" w:eastAsia="Aptos" w:hAnsi="Cambria Math" w:cs="Times New Roman"/>
@@ -3821,7 +3821,6 @@
               </w:rPr>
               <w:t>active_cycle</w:t>
             </w:r>
-            <w:proofErr w:type="spellEnd"/>
           </w:p>
           <w:p>
             <w:pPr>
@@ -4006,7 +4005,7 @@
         </w:tc>
         <w:tc>
           <w:tcPr>
-            <w:tcW w:w="2364" w:type="dxa"/>
+            <w:tcW w:w="2427" w:type="dxa"/>
           </w:tcPr>
           <w:p>
             <w:pPr>

</xml_diff>

<commit_message>
Cap reserve clone class at 10 (team decision 2026-07-09)
The Beliebtheit scale ends at 10, so the nightweekend clone no longer gets
class 11: clone class = min(original + 1, 10). It now shares class 10 with
its original, which merges them in Pesch2/Pesch3 class accounting (accepted
by the team). definitions.docx updated accordingly.

Verified by a full run: output classes 2/3/5/6/7/8/10 (class_11 column gone),
22 active weeks, deviation 32h, Pesch0/6/7 = 0. The stale warm start from the
class-11 model was correctly rejected by Gurobi (violates the new Pesch2
share constraint) and a fresh one was saved.

Co-Authored-By: Claude Fable 5 <noreply@anthropic.com>
</commit_message>
<xml_diff>
--- a/docs/definitions.docx
+++ b/docs/definitions.docx
@@ -3275,7 +3275,7 @@
           </w:tcPr>
           <w:p>
             <w:r>
-              <w:t>REPLACED: dynamic reserve clones, one per shiftID, count = max(1, floor(reserve_clone_ratio * required staff)), class = original + 1</w:t>
+              <w:t>REPLACED: dynamic reserve clones, one per shiftID, count = max(1, floor(reserve_clone_ratio * required staff)), class = min(original + 1, 10)</w:t>
             </w:r>
           </w:p>
         </w:tc>
@@ -3293,7 +3293,7 @@
           </w:tcPr>
           <w:p>
             <w:r>
-              <w:t>clones of all 4 dataset shifts: 1 each, classes 3/8/6/11</w:t>
+              <w:t>clones of all 4 dataset shifts: 1 each, classes 3/8/6/10</w:t>
             </w:r>
           </w:p>
         </w:tc>
@@ -3323,7 +3323,7 @@
           </w:tcPr>
           <w:p>
             <w:r>
-              <w:t>called inside readShiftSet before the explode; class 11 exceeds the 1-10 Beliebtheit scale (ordinal, flagged for the report)</w:t>
+              <w:t>called inside readShiftSet before the explode; class capped at 10 (team 2026-07-09), so the nightweekend clone shares class 10 with its original</w:t>
             </w:r>
           </w:p>
         </w:tc>

</xml_diff>